<commit_message>
Documentação atualizada, correção de erros
</commit_message>
<xml_diff>
--- a/Main/docs/TI-Documentacao-Sensor_de_umidade_na_Soja-Grupo_8 - certo.docx
+++ b/Main/docs/TI-Documentacao-Sensor_de_umidade_na_Soja-Grupo_8 - certo.docx
@@ -698,15 +698,7 @@
           <w:color w:val="7F7F7F" w:themeColor="text1" w:themeTint="80"/>
           <w:szCs w:val="24"/>
         </w:rPr>
-        <w:t>em</w:t>
-      </w:r>
-      <w:r>
-        <w:rPr>
-          <w:rFonts w:cs="Arial"/>
-          <w:color w:val="7F7F7F" w:themeColor="text1" w:themeTint="80"/>
-          <w:szCs w:val="24"/>
-        </w:rPr>
-        <w:t xml:space="preserve"> Ciência da Computação da Faculdade </w:t>
+        <w:t xml:space="preserve">em Ciência da Computação da Faculdade </w:t>
       </w:r>
       <w:proofErr w:type="spellStart"/>
       <w:r>
@@ -851,13 +843,13 @@
       <w:pPr>
         <w:pStyle w:val="Ttulo1"/>
       </w:pPr>
-      <w:bookmarkStart w:id="1" w:name="_Toc168401215"/>
-      <w:bookmarkStart w:id="2" w:name="_Toc199966139"/>
+      <w:bookmarkStart w:id="1" w:name="_Toc199966139"/>
+      <w:bookmarkStart w:id="2" w:name="_Toc168401215"/>
       <w:r>
         <w:lastRenderedPageBreak/>
         <w:t>RESUMO</w:t>
       </w:r>
-      <w:bookmarkEnd w:id="2"/>
+      <w:bookmarkEnd w:id="1"/>
     </w:p>
     <w:p>
       <w:pPr>
@@ -3390,6 +3382,7 @@
       <w:sdtPr>
         <w:rPr>
           <w:rFonts w:asciiTheme="minorHAnsi" w:hAnsiTheme="minorHAnsi"/>
+          <w:b w:val="0"/>
           <w:sz w:val="22"/>
         </w:rPr>
         <w:id w:val="-1676883154"/>
@@ -3401,7 +3394,6 @@
       <w:sdtEndPr>
         <w:rPr>
           <w:rFonts w:ascii="Arial" w:hAnsi="Arial"/>
-          <w:b w:val="0"/>
           <w:bCs/>
           <w:sz w:val="24"/>
         </w:rPr>
@@ -3418,81 +3410,79 @@
         <w:p>
           <w:pPr>
             <w:pStyle w:val="Sumrio1"/>
-            <w:tabs>
-              <w:tab w:val="right" w:leader="dot" w:pos="9061"/>
-            </w:tabs>
             <w:rPr>
               <w:rFonts w:asciiTheme="minorHAnsi" w:eastAsiaTheme="minorEastAsia" w:hAnsiTheme="minorHAnsi"/>
-              <w:b w:val="0"/>
-              <w:noProof/>
               <w:kern w:val="2"/>
-              <w:sz w:val="24"/>
               <w:szCs w:val="24"/>
               <w:lang w:eastAsia="pt-BR"/>
               <w14:ligatures w14:val="standardContextual"/>
             </w:rPr>
           </w:pPr>
           <w:r>
+            <w:rPr>
+              <w:sz w:val="28"/>
+            </w:rPr>
             <w:fldChar w:fldCharType="begin"/>
           </w:r>
           <w:r>
             <w:instrText xml:space="preserve"> TOC \o "1-3" \h \z \u </w:instrText>
           </w:r>
           <w:r>
+            <w:rPr>
+              <w:sz w:val="28"/>
+            </w:rPr>
             <w:fldChar w:fldCharType="separate"/>
           </w:r>
           <w:hyperlink w:anchor="_Toc199966139" w:history="1">
             <w:r>
               <w:rPr>
                 <w:rStyle w:val="Hyperlink"/>
-                <w:noProof/>
-              </w:rPr>
-              <w:t>RESUMO</w:t>
-            </w:r>
-            <w:r>
-              <w:rPr>
-                <w:noProof/>
+              </w:rPr>
+              <w:t>R</w:t>
+            </w:r>
+            <w:r>
+              <w:rPr>
+                <w:rStyle w:val="Hyperlink"/>
+              </w:rPr>
+              <w:t>esumo</w:t>
+            </w:r>
+            <w:r>
+              <w:rPr>
                 <w:webHidden/>
               </w:rPr>
               <w:tab/>
             </w:r>
             <w:r>
               <w:rPr>
-                <w:noProof/>
                 <w:webHidden/>
               </w:rPr>
               <w:fldChar w:fldCharType="begin"/>
             </w:r>
             <w:r>
               <w:rPr>
-                <w:noProof/>
                 <w:webHidden/>
               </w:rPr>
               <w:instrText xml:space="preserve"> PAGEREF _Toc199966139 \h </w:instrText>
             </w:r>
             <w:r>
               <w:rPr>
-                <w:noProof/>
-                <w:webHidden/>
-              </w:rPr>
-            </w:r>
-            <w:r>
-              <w:rPr>
-                <w:noProof/>
+                <w:webHidden/>
+              </w:rPr>
+            </w:r>
+            <w:r>
+              <w:rPr>
                 <w:webHidden/>
               </w:rPr>
               <w:fldChar w:fldCharType="separate"/>
             </w:r>
             <w:r>
               <w:rPr>
-                <w:noProof/>
                 <w:webHidden/>
               </w:rPr>
               <w:t>4</w:t>
             </w:r>
             <w:r>
               <w:rPr>
-                <w:noProof/>
                 <w:webHidden/>
               </w:rPr>
               <w:fldChar w:fldCharType="end"/>
@@ -3502,16 +3492,11 @@
         <w:p>
           <w:pPr>
             <w:pStyle w:val="Sumrio1"/>
-            <w:tabs>
-              <w:tab w:val="right" w:leader="dot" w:pos="9061"/>
-            </w:tabs>
             <w:rPr>
               <w:rFonts w:asciiTheme="minorHAnsi" w:eastAsiaTheme="minorEastAsia" w:hAnsiTheme="minorHAnsi"/>
-              <w:b w:val="0"/>
-              <w:noProof/>
               <w:kern w:val="2"/>
-              <w:sz w:val="24"/>
-              <w:szCs w:val="24"/>
+              <w:sz w:val="22"/>
+              <w:szCs w:val="22"/>
               <w:lang w:eastAsia="pt-BR"/>
               <w14:ligatures w14:val="standardContextual"/>
             </w:rPr>
@@ -3520,54 +3505,52 @@
             <w:r>
               <w:rPr>
                 <w:rStyle w:val="Hyperlink"/>
-                <w:noProof/>
-              </w:rPr>
-              <w:t>ABSTRACT</w:t>
-            </w:r>
-            <w:r>
-              <w:rPr>
-                <w:noProof/>
+              </w:rPr>
+              <w:t>A</w:t>
+            </w:r>
+            <w:r>
+              <w:rPr>
+                <w:rStyle w:val="Hyperlink"/>
+              </w:rPr>
+              <w:t>bstract</w:t>
+            </w:r>
+            <w:r>
+              <w:rPr>
                 <w:webHidden/>
               </w:rPr>
               <w:tab/>
             </w:r>
             <w:r>
               <w:rPr>
-                <w:noProof/>
                 <w:webHidden/>
               </w:rPr>
               <w:fldChar w:fldCharType="begin"/>
             </w:r>
             <w:r>
               <w:rPr>
-                <w:noProof/>
                 <w:webHidden/>
               </w:rPr>
               <w:instrText xml:space="preserve"> PAGEREF _Toc199966140 \h </w:instrText>
             </w:r>
             <w:r>
               <w:rPr>
-                <w:noProof/>
-                <w:webHidden/>
-              </w:rPr>
-            </w:r>
-            <w:r>
-              <w:rPr>
-                <w:noProof/>
+                <w:webHidden/>
+              </w:rPr>
+            </w:r>
+            <w:r>
+              <w:rPr>
                 <w:webHidden/>
               </w:rPr>
               <w:fldChar w:fldCharType="separate"/>
             </w:r>
             <w:r>
               <w:rPr>
-                <w:noProof/>
                 <w:webHidden/>
               </w:rPr>
               <w:t>5</w:t>
             </w:r>
             <w:r>
               <w:rPr>
-                <w:noProof/>
                 <w:webHidden/>
               </w:rPr>
               <w:fldChar w:fldCharType="end"/>
@@ -3577,15 +3560,9 @@
         <w:p>
           <w:pPr>
             <w:pStyle w:val="Sumrio1"/>
-            <w:tabs>
-              <w:tab w:val="right" w:leader="dot" w:pos="9061"/>
-            </w:tabs>
             <w:rPr>
               <w:rFonts w:asciiTheme="minorHAnsi" w:eastAsiaTheme="minorEastAsia" w:hAnsiTheme="minorHAnsi"/>
-              <w:b w:val="0"/>
-              <w:noProof/>
               <w:kern w:val="2"/>
-              <w:sz w:val="24"/>
               <w:szCs w:val="24"/>
               <w:lang w:eastAsia="pt-BR"/>
               <w14:ligatures w14:val="standardContextual"/>
@@ -3595,54 +3572,52 @@
             <w:r>
               <w:rPr>
                 <w:rStyle w:val="Hyperlink"/>
-                <w:noProof/>
-              </w:rPr>
-              <w:t>1. INTRODUÇÃO</w:t>
-            </w:r>
-            <w:r>
-              <w:rPr>
-                <w:noProof/>
+              </w:rPr>
+              <w:t xml:space="preserve">1. </w:t>
+            </w:r>
+            <w:r>
+              <w:rPr>
+                <w:rStyle w:val="Hyperlink"/>
+              </w:rPr>
+              <w:t>Introdução</w:t>
+            </w:r>
+            <w:r>
+              <w:rPr>
                 <w:webHidden/>
               </w:rPr>
               <w:tab/>
             </w:r>
             <w:r>
               <w:rPr>
-                <w:noProof/>
                 <w:webHidden/>
               </w:rPr>
               <w:fldChar w:fldCharType="begin"/>
             </w:r>
             <w:r>
               <w:rPr>
-                <w:noProof/>
                 <w:webHidden/>
               </w:rPr>
               <w:instrText xml:space="preserve"> PAGEREF _Toc199966141 \h </w:instrText>
             </w:r>
             <w:r>
               <w:rPr>
-                <w:noProof/>
-                <w:webHidden/>
-              </w:rPr>
-            </w:r>
-            <w:r>
-              <w:rPr>
-                <w:noProof/>
+                <w:webHidden/>
+              </w:rPr>
+            </w:r>
+            <w:r>
+              <w:rPr>
                 <w:webHidden/>
               </w:rPr>
               <w:fldChar w:fldCharType="separate"/>
             </w:r>
             <w:r>
               <w:rPr>
-                <w:noProof/>
                 <w:webHidden/>
               </w:rPr>
               <w:t>11</w:t>
             </w:r>
             <w:r>
               <w:rPr>
-                <w:noProof/>
                 <w:webHidden/>
               </w:rPr>
               <w:fldChar w:fldCharType="end"/>
@@ -4170,15 +4145,9 @@
         <w:p>
           <w:pPr>
             <w:pStyle w:val="Sumrio1"/>
-            <w:tabs>
-              <w:tab w:val="right" w:leader="dot" w:pos="9061"/>
-            </w:tabs>
             <w:rPr>
               <w:rFonts w:asciiTheme="minorHAnsi" w:eastAsiaTheme="minorEastAsia" w:hAnsiTheme="minorHAnsi"/>
-              <w:b w:val="0"/>
-              <w:noProof/>
               <w:kern w:val="2"/>
-              <w:sz w:val="24"/>
               <w:szCs w:val="24"/>
               <w:lang w:eastAsia="pt-BR"/>
               <w14:ligatures w14:val="standardContextual"/>
@@ -4188,54 +4157,52 @@
             <w:r>
               <w:rPr>
                 <w:rStyle w:val="Hyperlink"/>
-                <w:noProof/>
-              </w:rPr>
-              <w:t>CONTEXTO</w:t>
-            </w:r>
-            <w:r>
-              <w:rPr>
-                <w:noProof/>
+              </w:rPr>
+              <w:t>C</w:t>
+            </w:r>
+            <w:r>
+              <w:rPr>
+                <w:rStyle w:val="Hyperlink"/>
+              </w:rPr>
+              <w:t>ontexto</w:t>
+            </w:r>
+            <w:r>
+              <w:rPr>
                 <w:webHidden/>
               </w:rPr>
               <w:tab/>
             </w:r>
             <w:r>
               <w:rPr>
-                <w:noProof/>
                 <w:webHidden/>
               </w:rPr>
               <w:fldChar w:fldCharType="begin"/>
             </w:r>
             <w:r>
               <w:rPr>
-                <w:noProof/>
                 <w:webHidden/>
               </w:rPr>
               <w:instrText xml:space="preserve"> PAGEREF _Toc199966149 \h </w:instrText>
             </w:r>
             <w:r>
               <w:rPr>
-                <w:noProof/>
-                <w:webHidden/>
-              </w:rPr>
-            </w:r>
-            <w:r>
-              <w:rPr>
-                <w:noProof/>
+                <w:webHidden/>
+              </w:rPr>
+            </w:r>
+            <w:r>
+              <w:rPr>
                 <w:webHidden/>
               </w:rPr>
               <w:fldChar w:fldCharType="separate"/>
             </w:r>
             <w:r>
               <w:rPr>
-                <w:noProof/>
                 <w:webHidden/>
               </w:rPr>
               <w:t>14</w:t>
             </w:r>
             <w:r>
               <w:rPr>
-                <w:noProof/>
                 <w:webHidden/>
               </w:rPr>
               <w:fldChar w:fldCharType="end"/>
@@ -4393,15 +4360,9 @@
         <w:p>
           <w:pPr>
             <w:pStyle w:val="Sumrio1"/>
-            <w:tabs>
-              <w:tab w:val="right" w:leader="dot" w:pos="9061"/>
-            </w:tabs>
             <w:rPr>
               <w:rFonts w:asciiTheme="minorHAnsi" w:eastAsiaTheme="minorEastAsia" w:hAnsiTheme="minorHAnsi"/>
-              <w:b w:val="0"/>
-              <w:noProof/>
               <w:kern w:val="2"/>
-              <w:sz w:val="24"/>
               <w:szCs w:val="24"/>
               <w:lang w:eastAsia="pt-BR"/>
               <w14:ligatures w14:val="standardContextual"/>
@@ -4412,54 +4373,53 @@
               <w:rPr>
                 <w:rStyle w:val="Hyperlink"/>
                 <w:rFonts w:eastAsia="Arial"/>
-                <w:noProof/>
-              </w:rPr>
-              <w:t>OBJETIVO</w:t>
-            </w:r>
-            <w:r>
-              <w:rPr>
-                <w:noProof/>
+              </w:rPr>
+              <w:t>O</w:t>
+            </w:r>
+            <w:r>
+              <w:rPr>
+                <w:rStyle w:val="Hyperlink"/>
+                <w:rFonts w:eastAsia="Arial"/>
+              </w:rPr>
+              <w:t>bjetivo</w:t>
+            </w:r>
+            <w:r>
+              <w:rPr>
                 <w:webHidden/>
               </w:rPr>
               <w:tab/>
             </w:r>
             <w:r>
               <w:rPr>
-                <w:noProof/>
                 <w:webHidden/>
               </w:rPr>
               <w:fldChar w:fldCharType="begin"/>
             </w:r>
             <w:r>
               <w:rPr>
-                <w:noProof/>
                 <w:webHidden/>
               </w:rPr>
               <w:instrText xml:space="preserve"> PAGEREF _Toc199966152 \h </w:instrText>
             </w:r>
             <w:r>
               <w:rPr>
-                <w:noProof/>
-                <w:webHidden/>
-              </w:rPr>
-            </w:r>
-            <w:r>
-              <w:rPr>
-                <w:noProof/>
+                <w:webHidden/>
+              </w:rPr>
+            </w:r>
+            <w:r>
+              <w:rPr>
                 <w:webHidden/>
               </w:rPr>
               <w:fldChar w:fldCharType="separate"/>
             </w:r>
             <w:r>
               <w:rPr>
-                <w:noProof/>
                 <w:webHidden/>
               </w:rPr>
               <w:t>18</w:t>
             </w:r>
             <w:r>
               <w:rPr>
-                <w:noProof/>
                 <w:webHidden/>
               </w:rPr>
               <w:fldChar w:fldCharType="end"/>
@@ -4469,15 +4429,9 @@
         <w:p>
           <w:pPr>
             <w:pStyle w:val="Sumrio1"/>
-            <w:tabs>
-              <w:tab w:val="right" w:leader="dot" w:pos="9061"/>
-            </w:tabs>
             <w:rPr>
               <w:rFonts w:asciiTheme="minorHAnsi" w:eastAsiaTheme="minorEastAsia" w:hAnsiTheme="minorHAnsi"/>
-              <w:b w:val="0"/>
-              <w:noProof/>
               <w:kern w:val="2"/>
-              <w:sz w:val="24"/>
               <w:szCs w:val="24"/>
               <w:lang w:eastAsia="pt-BR"/>
               <w14:ligatures w14:val="standardContextual"/>
@@ -4487,54 +4441,52 @@
             <w:r>
               <w:rPr>
                 <w:rStyle w:val="Hyperlink"/>
-                <w:noProof/>
-              </w:rPr>
-              <w:t>JUSTIFICATIVA</w:t>
-            </w:r>
-            <w:r>
-              <w:rPr>
-                <w:noProof/>
+              </w:rPr>
+              <w:t>J</w:t>
+            </w:r>
+            <w:r>
+              <w:rPr>
+                <w:rStyle w:val="Hyperlink"/>
+              </w:rPr>
+              <w:t>ustificativa</w:t>
+            </w:r>
+            <w:r>
+              <w:rPr>
                 <w:webHidden/>
               </w:rPr>
               <w:tab/>
             </w:r>
             <w:r>
               <w:rPr>
-                <w:noProof/>
                 <w:webHidden/>
               </w:rPr>
               <w:fldChar w:fldCharType="begin"/>
             </w:r>
             <w:r>
               <w:rPr>
-                <w:noProof/>
                 <w:webHidden/>
               </w:rPr>
               <w:instrText xml:space="preserve"> PAGEREF _Toc199966153 \h </w:instrText>
             </w:r>
             <w:r>
               <w:rPr>
-                <w:noProof/>
-                <w:webHidden/>
-              </w:rPr>
-            </w:r>
-            <w:r>
-              <w:rPr>
-                <w:noProof/>
+                <w:webHidden/>
+              </w:rPr>
+            </w:r>
+            <w:r>
+              <w:rPr>
                 <w:webHidden/>
               </w:rPr>
               <w:fldChar w:fldCharType="separate"/>
             </w:r>
             <w:r>
               <w:rPr>
-                <w:noProof/>
                 <w:webHidden/>
               </w:rPr>
               <w:t>19</w:t>
             </w:r>
             <w:r>
               <w:rPr>
-                <w:noProof/>
                 <w:webHidden/>
               </w:rPr>
               <w:fldChar w:fldCharType="end"/>
@@ -4840,15 +4792,9 @@
         <w:p>
           <w:pPr>
             <w:pStyle w:val="Sumrio1"/>
-            <w:tabs>
-              <w:tab w:val="right" w:leader="dot" w:pos="9061"/>
-            </w:tabs>
             <w:rPr>
               <w:rFonts w:asciiTheme="minorHAnsi" w:eastAsiaTheme="minorEastAsia" w:hAnsiTheme="minorHAnsi"/>
-              <w:b w:val="0"/>
-              <w:noProof/>
               <w:kern w:val="2"/>
-              <w:sz w:val="24"/>
               <w:szCs w:val="24"/>
               <w:lang w:eastAsia="pt-BR"/>
               <w14:ligatures w14:val="standardContextual"/>
@@ -4858,54 +4804,52 @@
             <w:r>
               <w:rPr>
                 <w:rStyle w:val="Hyperlink"/>
-                <w:noProof/>
-              </w:rPr>
-              <w:t>ESCOPO</w:t>
-            </w:r>
-            <w:r>
-              <w:rPr>
-                <w:noProof/>
+              </w:rPr>
+              <w:t>E</w:t>
+            </w:r>
+            <w:r>
+              <w:rPr>
+                <w:rStyle w:val="Hyperlink"/>
+              </w:rPr>
+              <w:t>scopo</w:t>
+            </w:r>
+            <w:r>
+              <w:rPr>
                 <w:webHidden/>
               </w:rPr>
               <w:tab/>
             </w:r>
             <w:r>
               <w:rPr>
-                <w:noProof/>
                 <w:webHidden/>
               </w:rPr>
               <w:fldChar w:fldCharType="begin"/>
             </w:r>
             <w:r>
               <w:rPr>
-                <w:noProof/>
                 <w:webHidden/>
               </w:rPr>
               <w:instrText xml:space="preserve"> PAGEREF _Toc199966158 \h </w:instrText>
             </w:r>
             <w:r>
               <w:rPr>
-                <w:noProof/>
-                <w:webHidden/>
-              </w:rPr>
-            </w:r>
-            <w:r>
-              <w:rPr>
-                <w:noProof/>
+                <w:webHidden/>
+              </w:rPr>
+            </w:r>
+            <w:r>
+              <w:rPr>
                 <w:webHidden/>
               </w:rPr>
               <w:fldChar w:fldCharType="separate"/>
             </w:r>
             <w:r>
               <w:rPr>
-                <w:noProof/>
                 <w:webHidden/>
               </w:rPr>
               <w:t>20</w:t>
             </w:r>
             <w:r>
               <w:rPr>
-                <w:noProof/>
                 <w:webHidden/>
               </w:rPr>
               <w:fldChar w:fldCharType="end"/>
@@ -5359,15 +5303,9 @@
         <w:p>
           <w:pPr>
             <w:pStyle w:val="Sumrio1"/>
-            <w:tabs>
-              <w:tab w:val="right" w:leader="dot" w:pos="9061"/>
-            </w:tabs>
             <w:rPr>
               <w:rFonts w:asciiTheme="minorHAnsi" w:eastAsiaTheme="minorEastAsia" w:hAnsiTheme="minorHAnsi"/>
-              <w:b w:val="0"/>
-              <w:noProof/>
               <w:kern w:val="2"/>
-              <w:sz w:val="24"/>
               <w:szCs w:val="24"/>
               <w:lang w:eastAsia="pt-BR"/>
               <w14:ligatures w14:val="standardContextual"/>
@@ -5378,54 +5316,60 @@
               <w:rPr>
                 <w:rStyle w:val="Hyperlink"/>
                 <w:rFonts w:eastAsia="Arial"/>
-                <w:noProof/>
-              </w:rPr>
-              <w:t>PREMISSAS E RESTRIÇÕES:</w:t>
-            </w:r>
-            <w:r>
-              <w:rPr>
-                <w:noProof/>
+              </w:rPr>
+              <w:t>P</w:t>
+            </w:r>
+            <w:r>
+              <w:rPr>
+                <w:rStyle w:val="Hyperlink"/>
+                <w:rFonts w:eastAsia="Arial"/>
+              </w:rPr>
+              <w:t>remissas e restrições</w:t>
+            </w:r>
+            <w:r>
+              <w:rPr>
+                <w:rStyle w:val="Hyperlink"/>
+                <w:rFonts w:eastAsia="Arial"/>
+              </w:rPr>
+              <w:t>:</w:t>
+            </w:r>
+            <w:r>
+              <w:rPr>
                 <w:webHidden/>
               </w:rPr>
               <w:tab/>
             </w:r>
             <w:r>
               <w:rPr>
-                <w:noProof/>
                 <w:webHidden/>
               </w:rPr>
               <w:fldChar w:fldCharType="begin"/>
             </w:r>
             <w:r>
               <w:rPr>
-                <w:noProof/>
                 <w:webHidden/>
               </w:rPr>
               <w:instrText xml:space="preserve"> PAGEREF _Toc199966165 \h </w:instrText>
             </w:r>
             <w:r>
               <w:rPr>
-                <w:noProof/>
-                <w:webHidden/>
-              </w:rPr>
-            </w:r>
-            <w:r>
-              <w:rPr>
-                <w:noProof/>
+                <w:webHidden/>
+              </w:rPr>
+            </w:r>
+            <w:r>
+              <w:rPr>
                 <w:webHidden/>
               </w:rPr>
               <w:fldChar w:fldCharType="separate"/>
             </w:r>
             <w:r>
               <w:rPr>
-                <w:noProof/>
                 <w:webHidden/>
               </w:rPr>
               <w:t>24</w:t>
             </w:r>
             <w:r>
               <w:rPr>
-                <w:noProof/>
                 <w:webHidden/>
               </w:rPr>
               <w:fldChar w:fldCharType="end"/>
@@ -5435,15 +5379,9 @@
         <w:p>
           <w:pPr>
             <w:pStyle w:val="Sumrio1"/>
-            <w:tabs>
-              <w:tab w:val="right" w:leader="dot" w:pos="9061"/>
-            </w:tabs>
             <w:rPr>
               <w:rFonts w:asciiTheme="minorHAnsi" w:eastAsiaTheme="minorEastAsia" w:hAnsiTheme="minorHAnsi"/>
-              <w:b w:val="0"/>
-              <w:noProof/>
               <w:kern w:val="2"/>
-              <w:sz w:val="24"/>
               <w:szCs w:val="24"/>
               <w:lang w:eastAsia="pt-BR"/>
               <w14:ligatures w14:val="standardContextual"/>
@@ -5453,54 +5391,58 @@
             <w:r>
               <w:rPr>
                 <w:rStyle w:val="Hyperlink"/>
-                <w:noProof/>
-              </w:rPr>
-              <w:t>BIBLIOGRAFIA:</w:t>
-            </w:r>
-            <w:r>
-              <w:rPr>
-                <w:noProof/>
+              </w:rPr>
+              <w:t>B</w:t>
+            </w:r>
+            <w:r>
+              <w:rPr>
+                <w:rStyle w:val="Hyperlink"/>
+              </w:rPr>
+              <w:t>ibliografia</w:t>
+            </w:r>
+            <w:r>
+              <w:rPr>
+                <w:rStyle w:val="Hyperlink"/>
+              </w:rPr>
+              <w:t>:</w:t>
+            </w:r>
+            <w:r>
+              <w:rPr>
                 <w:webHidden/>
               </w:rPr>
               <w:tab/>
             </w:r>
             <w:r>
               <w:rPr>
-                <w:noProof/>
                 <w:webHidden/>
               </w:rPr>
               <w:fldChar w:fldCharType="begin"/>
             </w:r>
             <w:r>
               <w:rPr>
-                <w:noProof/>
                 <w:webHidden/>
               </w:rPr>
               <w:instrText xml:space="preserve"> PAGEREF _Toc199966166 \h </w:instrText>
             </w:r>
             <w:r>
               <w:rPr>
-                <w:noProof/>
-                <w:webHidden/>
-              </w:rPr>
-            </w:r>
-            <w:r>
-              <w:rPr>
-                <w:noProof/>
+                <w:webHidden/>
+              </w:rPr>
+            </w:r>
+            <w:r>
+              <w:rPr>
                 <w:webHidden/>
               </w:rPr>
               <w:fldChar w:fldCharType="separate"/>
             </w:r>
             <w:r>
               <w:rPr>
-                <w:noProof/>
                 <w:webHidden/>
               </w:rPr>
               <w:t>26</w:t>
             </w:r>
             <w:r>
               <w:rPr>
-                <w:noProof/>
                 <w:webHidden/>
               </w:rPr>
               <w:fldChar w:fldCharType="end"/>
@@ -5533,7 +5475,6 @@
     <w:p>
       <w:pPr>
         <w:pStyle w:val="Sumrio1"/>
-        <w:outlineLvl w:val="0"/>
       </w:pPr>
       <w:bookmarkStart w:id="4" w:name="_Toc199966141"/>
       <w:r>
@@ -5547,7 +5488,7 @@
         <w:t>INTRODUÇÃO</w:t>
       </w:r>
       <w:bookmarkEnd w:id="0"/>
-      <w:bookmarkEnd w:id="1"/>
+      <w:bookmarkEnd w:id="2"/>
       <w:bookmarkEnd w:id="4"/>
     </w:p>
     <w:p>
@@ -5558,8 +5499,8 @@
         </w:rPr>
       </w:pPr>
       <w:bookmarkStart w:id="5" w:name="_Toc168401216"/>
-      <w:bookmarkStart w:id="6" w:name="_Toc168297634"/>
-      <w:bookmarkStart w:id="7" w:name="_Toc199966142"/>
+      <w:bookmarkStart w:id="6" w:name="_Toc199966142"/>
+      <w:bookmarkStart w:id="7" w:name="_Toc168297634"/>
       <w:r>
         <w:t>1.</w:t>
       </w:r>
@@ -5573,7 +5514,7 @@
       <w:r>
         <w:t>Problematização</w:t>
       </w:r>
-      <w:bookmarkEnd w:id="7"/>
+      <w:bookmarkEnd w:id="6"/>
     </w:p>
     <w:p>
       <w:pPr>
@@ -5642,7 +5583,7 @@
       <w:r>
         <w:t>Objetivos</w:t>
       </w:r>
-      <w:bookmarkEnd w:id="6"/>
+      <w:bookmarkEnd w:id="7"/>
       <w:bookmarkEnd w:id="8"/>
       <w:bookmarkEnd w:id="9"/>
     </w:p>
@@ -7559,13 +7500,7 @@
         <w:rPr>
           <w:rFonts w:eastAsia="Arial" w:cs="Arial"/>
         </w:rPr>
-        <w:t>safra</w:t>
-      </w:r>
-      <w:r>
-        <w:rPr>
-          <w:rFonts w:eastAsia="Arial" w:cs="Arial"/>
-        </w:rPr>
-        <w:t>.</w:t>
+        <w:t>safra.</w:t>
       </w:r>
     </w:p>
     <w:p>
@@ -13214,13 +13149,17 @@
     <w:uiPriority w:val="39"/>
     <w:unhideWhenUsed/>
     <w:qFormat/>
-    <w:rsid w:val="00BC0B5A"/>
+    <w:rsid w:val="00F636B5"/>
     <w:pPr>
+      <w:tabs>
+        <w:tab w:val="right" w:leader="dot" w:pos="9061"/>
+      </w:tabs>
       <w:spacing w:after="120" w:line="240" w:lineRule="auto"/>
     </w:pPr>
     <w:rPr>
       <w:b/>
-      <w:sz w:val="28"/>
+      <w:noProof/>
+      <w:szCs w:val="20"/>
     </w:rPr>
   </w:style>
   <w:style w:type="paragraph" w:styleId="Sumrio2">

</xml_diff>